<commit_message>
docs: les trois documents remis à jour
Ils dataient d'avant les photos, les bandeaux et le temps réel de
l'administration.

L'essentiel : les photos passent en « fait », les chiffres sont repris
(39 routes, 26 critères plus 18 sur les images), et la mise à jour du
projet par maj.cmd rejoint la partie installation.

Comprendre Kayna Kayna Pay : lib/medias.js entre dans la carte du
dossier ; deux pièges s'ajoutent au chapitre 10, ceux qui ont réellement
coûté du temps — une règle .gitignore sans barre initiale, qui exclut du
dépôt un fichier de code présent chez son auteur, et un git pull qui
échoue sans qu'on le voie.

Guide d'utilisation : la gestion des photos côté équipe, avec la raison
de leur réduction ; les bandeaux côté client, et ce qu'ils ne font pas
encore quand l'application est fermée ; le temps réel sur toutes les
pages de l'administration.
</commit_message>
<xml_diff>
--- a/kayna-kayna-pay/docs/Comprendre_Kayna_Kayna_Pay.docx
+++ b/kayna-kayna-pay/docs/Comprendre_Kayna_Kayna_Pay.docx
@@ -3555,6 +3555,60 @@
                 <w:sz w:val="17"/>
                 <w:szCs w:val="17"/>
               </w:rPr>
+              <w:t xml:space="preserve">plateforme/lib/medias.js</w:t>
+            </w:r>
+          </w:p>
+        </w:tc>
+        <w:tc>
+          <w:tcPr>
+            <w:tcW w:type="dxa" w:w="5960"/>
+            <w:tcMar>
+              <w:top w:type="dxa" w:w="80"/>
+              <w:left w:type="dxa" w:w="130"/>
+              <w:bottom w:type="dxa" w:w="80"/>
+              <w:right w:type="dxa" w:w="130"/>
+            </w:tcMar>
+            <w:vAlign w:val="top"/>
+          </w:tcPr>
+          <w:p>
+            <w:pPr>
+              <w:spacing w:after="0" w:line="252"/>
+            </w:pPr>
+            <w:r>
+              <w:rPr>
+                <w:rFonts w:ascii="Calibri" w:cs="Calibri" w:eastAsia="Calibri" w:hAnsi="Calibri"/>
+                <w:color w:val="1B2E42"/>
+                <w:sz w:val="17"/>
+                <w:szCs w:val="17"/>
+              </w:rPr>
+              <w:t xml:space="preserve">Photos de produits : réduction, écriture, service.</w:t>
+            </w:r>
+          </w:p>
+        </w:tc>
+      </w:tr>
+      <w:tr>
+        <w:tc>
+          <w:tcPr>
+            <w:tcW w:type="dxa" w:w="3400"/>
+            <w:tcMar>
+              <w:top w:type="dxa" w:w="80"/>
+              <w:left w:type="dxa" w:w="130"/>
+              <w:bottom w:type="dxa" w:w="80"/>
+              <w:right w:type="dxa" w:w="130"/>
+            </w:tcMar>
+            <w:vAlign w:val="top"/>
+          </w:tcPr>
+          <w:p>
+            <w:pPr>
+              <w:spacing w:after="0" w:line="252"/>
+            </w:pPr>
+            <w:r>
+              <w:rPr>
+                <w:rFonts w:ascii="Consolas" w:cs="Consolas" w:eastAsia="Consolas" w:hAnsi="Consolas"/>
+                <w:color w:val="1B2E42"/>
+                <w:sz w:val="17"/>
+                <w:szCs w:val="17"/>
+              </w:rPr>
               <w:t xml:space="preserve">plateforme/scripts/smoke.js</w:t>
             </w:r>
           </w:p>
@@ -3581,7 +3635,7 @@
                 <w:sz w:val="17"/>
                 <w:szCs w:val="17"/>
               </w:rPr>
-              <w:t xml:space="preserve">Le test de bout en bout : 25 critères d'acceptation.</w:t>
+              <w:t xml:space="preserve">Le test de bout en bout : 26 critères d'acceptation.</w:t>
             </w:r>
           </w:p>
         </w:tc>
@@ -7287,7 +7341,7 @@
           <w:sz w:val="20"/>
           <w:szCs w:val="20"/>
         </w:rPr>
-        <w:t xml:space="preserve">, rejoue le parcours complet contre un serveur réel et une base réelle, et vérifie 25 critères.</w:t>
+        <w:t xml:space="preserve">, rejoue le parcours complet contre un serveur réel et une base réelle, et vérifie 26 critères. Une seconde, npm run smoke:photos, en vérifie 18 sur les images.</w:t>
       </w:r>
     </w:p>
     <w:p>
@@ -8559,6 +8613,170 @@
           </w:p>
         </w:tc>
       </w:tr>
+      <w:tr>
+        <w:tc>
+          <w:tcPr>
+            <w:tcW w:type="dxa" w:w="2700"/>
+            <w:tcMar>
+              <w:top w:type="dxa" w:w="80"/>
+              <w:left w:type="dxa" w:w="130"/>
+              <w:bottom w:type="dxa" w:w="80"/>
+              <w:right w:type="dxa" w:w="130"/>
+            </w:tcMar>
+            <w:vAlign w:val="top"/>
+          </w:tcPr>
+          <w:p>
+            <w:pPr>
+              <w:spacing w:after="0" w:line="252"/>
+            </w:pPr>
+            <w:r>
+              <w:rPr>
+                <w:rFonts w:ascii="Calibri" w:cs="Calibri" w:eastAsia="Calibri" w:hAnsi="Calibri"/>
+                <w:b/>
+                <w:bCs/>
+                <w:color w:val="1B2E42"/>
+                <w:sz w:val="17"/>
+                <w:szCs w:val="17"/>
+              </w:rPr>
+              <w:t xml:space="preserve">Une règle .gitignore sans barre initiale</w:t>
+            </w:r>
+          </w:p>
+        </w:tc>
+        <w:tc>
+          <w:tcPr>
+            <w:tcW w:type="dxa" w:w="3600"/>
+            <w:tcMar>
+              <w:top w:type="dxa" w:w="80"/>
+              <w:left w:type="dxa" w:w="130"/>
+              <w:bottom w:type="dxa" w:w="80"/>
+              <w:right w:type="dxa" w:w="130"/>
+            </w:tcMar>
+            <w:vAlign w:val="top"/>
+          </w:tcPr>
+          <w:p>
+            <w:pPr>
+              <w:spacing w:after="0" w:line="252"/>
+            </w:pPr>
+            <w:r>
+              <w:rPr>
+                <w:rFonts w:ascii="Calibri" w:cs="Calibri" w:eastAsia="Calibri" w:hAnsi="Calibri"/>
+                <w:color w:val="1B2E42"/>
+                <w:sz w:val="17"/>
+                <w:szCs w:val="17"/>
+              </w:rPr>
+              <w:t xml:space="preserve">« medias/ » exclut tout dossier de ce nom, à toute profondeur — y compris la route qui sert les photos. Le code marche chez son auteur et manque partout ailleurs.</w:t>
+            </w:r>
+          </w:p>
+        </w:tc>
+        <w:tc>
+          <w:tcPr>
+            <w:tcW w:type="dxa" w:w="3060"/>
+            <w:tcMar>
+              <w:top w:type="dxa" w:w="80"/>
+              <w:left w:type="dxa" w:w="130"/>
+              <w:bottom w:type="dxa" w:w="80"/>
+              <w:right w:type="dxa" w:w="130"/>
+            </w:tcMar>
+            <w:vAlign w:val="top"/>
+          </w:tcPr>
+          <w:p>
+            <w:pPr>
+              <w:spacing w:after="0" w:line="252"/>
+            </w:pPr>
+            <w:r>
+              <w:rPr>
+                <w:rFonts w:ascii="Calibri" w:cs="Calibri" w:eastAsia="Calibri" w:hAnsi="Calibri"/>
+                <w:color w:val="1B2E42"/>
+                <w:sz w:val="17"/>
+                <w:szCs w:val="17"/>
+              </w:rPr>
+              <w:t xml:space="preserve">Ancrer la règle : « /medias/ ». npm run verifier signale désormais tout fichier de code exclu du dépôt.</w:t>
+            </w:r>
+          </w:p>
+        </w:tc>
+      </w:tr>
+      <w:tr>
+        <w:tc>
+          <w:tcPr>
+            <w:tcW w:type="dxa" w:w="2700"/>
+            <w:tcMar>
+              <w:top w:type="dxa" w:w="80"/>
+              <w:left w:type="dxa" w:w="130"/>
+              <w:bottom w:type="dxa" w:w="80"/>
+              <w:right w:type="dxa" w:w="130"/>
+            </w:tcMar>
+            <w:vAlign w:val="top"/>
+          </w:tcPr>
+          <w:p>
+            <w:pPr>
+              <w:spacing w:after="0" w:line="252"/>
+            </w:pPr>
+            <w:r>
+              <w:rPr>
+                <w:rFonts w:ascii="Calibri" w:cs="Calibri" w:eastAsia="Calibri" w:hAnsi="Calibri"/>
+                <w:b/>
+                <w:bCs/>
+                <w:color w:val="1B2E42"/>
+                <w:sz w:val="17"/>
+                <w:szCs w:val="17"/>
+              </w:rPr>
+              <w:t xml:space="preserve">Un git pull qui échoue en silence</w:t>
+            </w:r>
+          </w:p>
+        </w:tc>
+        <w:tc>
+          <w:tcPr>
+            <w:tcW w:type="dxa" w:w="3600"/>
+            <w:tcMar>
+              <w:top w:type="dxa" w:w="80"/>
+              <w:left w:type="dxa" w:w="130"/>
+              <w:bottom w:type="dxa" w:w="80"/>
+              <w:right w:type="dxa" w:w="130"/>
+            </w:tcMar>
+            <w:vAlign w:val="top"/>
+          </w:tcPr>
+          <w:p>
+            <w:pPr>
+              <w:spacing w:after="0" w:line="252"/>
+            </w:pPr>
+            <w:r>
+              <w:rPr>
+                <w:rFonts w:ascii="Calibri" w:cs="Calibri" w:eastAsia="Calibri" w:hAnsi="Calibri"/>
+                <w:color w:val="1B2E42"/>
+                <w:sz w:val="17"/>
+                <w:szCs w:val="17"/>
+              </w:rPr>
+              <w:t xml:space="preserve">Il s'arrête sur « Aborting », mais le serveur relancé ensuite démarre sur l'ancien code. On croit avoir mis à jour.</w:t>
+            </w:r>
+          </w:p>
+        </w:tc>
+        <w:tc>
+          <w:tcPr>
+            <w:tcW w:type="dxa" w:w="3060"/>
+            <w:tcMar>
+              <w:top w:type="dxa" w:w="80"/>
+              <w:left w:type="dxa" w:w="130"/>
+              <w:bottom w:type="dxa" w:w="80"/>
+              <w:right w:type="dxa" w:w="130"/>
+            </w:tcMar>
+            <w:vAlign w:val="top"/>
+          </w:tcPr>
+          <w:p>
+            <w:pPr>
+              <w:spacing w:after="0" w:line="252"/>
+            </w:pPr>
+            <w:r>
+              <w:rPr>
+                <w:rFonts w:ascii="Calibri" w:cs="Calibri" w:eastAsia="Calibri" w:hAnsi="Calibri"/>
+                <w:color w:val="1B2E42"/>
+                <w:sz w:val="17"/>
+                <w:szCs w:val="17"/>
+              </w:rPr>
+              <w:t xml:space="preserve">maj.cmd remet les fichiers de verrouillage npm en l'état avant de récupérer le code.</w:t>
+            </w:r>
+          </w:p>
+        </w:tc>
+      </w:tr>
     </w:tbl>
     <w:p>
       <w:pPr>
@@ -8904,6 +9122,88 @@
                 <w:sz w:val="17"/>
                 <w:szCs w:val="17"/>
               </w:rPr>
+              <w:t xml:space="preserve">Notifications hors application</w:t>
+            </w:r>
+          </w:p>
+        </w:tc>
+        <w:tc>
+          <w:tcPr>
+            <w:tcW w:type="dxa" w:w="4560"/>
+            <w:tcMar>
+              <w:top w:type="dxa" w:w="80"/>
+              <w:left w:type="dxa" w:w="130"/>
+              <w:bottom w:type="dxa" w:w="80"/>
+              <w:right w:type="dxa" w:w="130"/>
+            </w:tcMar>
+            <w:vAlign w:val="top"/>
+          </w:tcPr>
+          <w:p>
+            <w:pPr>
+              <w:spacing w:after="0" w:line="252"/>
+            </w:pPr>
+            <w:r>
+              <w:rPr>
+                <w:rFonts w:ascii="Calibri" w:cs="Calibri" w:eastAsia="Calibri" w:hAnsi="Calibri"/>
+                <w:color w:val="1B2E42"/>
+                <w:sz w:val="17"/>
+                <w:szCs w:val="17"/>
+              </w:rPr>
+              <w:t xml:space="preserve">Le temps réel ne fonctionne que si l'application est ouverte. Application fermée, le client n'apprend rien — lib/push.js n'est qu'un talon.</w:t>
+            </w:r>
+          </w:p>
+        </w:tc>
+        <w:tc>
+          <w:tcPr>
+            <w:tcW w:type="dxa" w:w="2200"/>
+            <w:tcMar>
+              <w:top w:type="dxa" w:w="80"/>
+              <w:left w:type="dxa" w:w="130"/>
+              <w:bottom w:type="dxa" w:w="80"/>
+              <w:right w:type="dxa" w:w="130"/>
+            </w:tcMar>
+            <w:vAlign w:val="top"/>
+          </w:tcPr>
+          <w:p>
+            <w:pPr>
+              <w:spacing w:after="0" w:line="252"/>
+            </w:pPr>
+            <w:r>
+              <w:rPr>
+                <w:rFonts w:ascii="Calibri" w:cs="Calibri" w:eastAsia="Calibri" w:hAnsi="Calibri"/>
+                <w:color w:val="1B2E42"/>
+                <w:sz w:val="17"/>
+                <w:szCs w:val="17"/>
+              </w:rPr>
+              <w:t xml:space="preserve">Quelques jours</w:t>
+            </w:r>
+          </w:p>
+        </w:tc>
+      </w:tr>
+      <w:tr>
+        <w:tc>
+          <w:tcPr>
+            <w:tcW w:type="dxa" w:w="2600"/>
+            <w:tcMar>
+              <w:top w:type="dxa" w:w="80"/>
+              <w:left w:type="dxa" w:w="130"/>
+              <w:bottom w:type="dxa" w:w="80"/>
+              <w:right w:type="dxa" w:w="130"/>
+            </w:tcMar>
+            <w:vAlign w:val="top"/>
+          </w:tcPr>
+          <w:p>
+            <w:pPr>
+              <w:spacing w:after="0" w:line="252"/>
+            </w:pPr>
+            <w:r>
+              <w:rPr>
+                <w:rFonts w:ascii="Calibri" w:cs="Calibri" w:eastAsia="Calibri" w:hAnsi="Calibri"/>
+                <w:b/>
+                <w:bCs/>
+                <w:color w:val="1B2E42"/>
+                <w:sz w:val="17"/>
+                <w:szCs w:val="17"/>
+              </w:rPr>
               <w:t xml:space="preserve">Gestion autonome du catalogue</w:t>
             </w:r>
           </w:p>
@@ -8930,7 +9230,7 @@
                 <w:sz w:val="17"/>
                 <w:szCs w:val="17"/>
               </w:rPr>
-              <w:t xml:space="preserve">Les partenaires consultent leurs produits mais ne les modifient pas encore.</w:t>
+              <w:t xml:space="preserve">Les partenaires consultent leurs produits et leurs photos, mais ne les modifient pas encore.</w:t>
             </w:r>
           </w:p>
         </w:tc>
@@ -8957,88 +9257,6 @@
                 <w:szCs w:val="17"/>
               </w:rPr>
               <w:t xml:space="preserve">Quelques semaines</w:t>
-            </w:r>
-          </w:p>
-        </w:tc>
-      </w:tr>
-      <w:tr>
-        <w:tc>
-          <w:tcPr>
-            <w:tcW w:type="dxa" w:w="2600"/>
-            <w:tcMar>
-              <w:top w:type="dxa" w:w="80"/>
-              <w:left w:type="dxa" w:w="130"/>
-              <w:bottom w:type="dxa" w:w="80"/>
-              <w:right w:type="dxa" w:w="130"/>
-            </w:tcMar>
-            <w:vAlign w:val="top"/>
-          </w:tcPr>
-          <w:p>
-            <w:pPr>
-              <w:spacing w:after="0" w:line="252"/>
-            </w:pPr>
-            <w:r>
-              <w:rPr>
-                <w:rFonts w:ascii="Calibri" w:cs="Calibri" w:eastAsia="Calibri" w:hAnsi="Calibri"/>
-                <w:b/>
-                <w:bCs/>
-                <w:color w:val="1B2E42"/>
-                <w:sz w:val="17"/>
-                <w:szCs w:val="17"/>
-              </w:rPr>
-              <w:t xml:space="preserve">Notifications push</w:t>
-            </w:r>
-          </w:p>
-        </w:tc>
-        <w:tc>
-          <w:tcPr>
-            <w:tcW w:type="dxa" w:w="4560"/>
-            <w:tcMar>
-              <w:top w:type="dxa" w:w="80"/>
-              <w:left w:type="dxa" w:w="130"/>
-              <w:bottom w:type="dxa" w:w="80"/>
-              <w:right w:type="dxa" w:w="130"/>
-            </w:tcMar>
-            <w:vAlign w:val="top"/>
-          </w:tcPr>
-          <w:p>
-            <w:pPr>
-              <w:spacing w:after="0" w:line="252"/>
-            </w:pPr>
-            <w:r>
-              <w:rPr>
-                <w:rFonts w:ascii="Calibri" w:cs="Calibri" w:eastAsia="Calibri" w:hAnsi="Calibri"/>
-                <w:color w:val="1B2E42"/>
-                <w:sz w:val="17"/>
-                <w:szCs w:val="17"/>
-              </w:rPr>
-              <w:t xml:space="preserve">Aujourd'hui le temps réel ne fonctionne que si l'application est ouverte.</w:t>
-            </w:r>
-          </w:p>
-        </w:tc>
-        <w:tc>
-          <w:tcPr>
-            <w:tcW w:type="dxa" w:w="2200"/>
-            <w:tcMar>
-              <w:top w:type="dxa" w:w="80"/>
-              <w:left w:type="dxa" w:w="130"/>
-              <w:bottom w:type="dxa" w:w="80"/>
-              <w:right w:type="dxa" w:w="130"/>
-            </w:tcMar>
-            <w:vAlign w:val="top"/>
-          </w:tcPr>
-          <w:p>
-            <w:pPr>
-              <w:spacing w:after="0" w:line="252"/>
-            </w:pPr>
-            <w:r>
-              <w:rPr>
-                <w:rFonts w:ascii="Calibri" w:cs="Calibri" w:eastAsia="Calibri" w:hAnsi="Calibri"/>
-                <w:color w:val="1B2E42"/>
-                <w:sz w:val="17"/>
-                <w:szCs w:val="17"/>
-              </w:rPr>
-              <w:t xml:space="preserve">Quelques jours</w:t>
             </w:r>
           </w:p>
         </w:tc>
@@ -9655,7 +9873,7 @@
                 <w:sz w:val="20"/>
                 <w:szCs w:val="20"/>
               </w:rPr>
-              <w:t xml:space="preserve"> : 25 critères d'acceptation rejoués contre un serveur et une base réels.</w:t>
+              <w:t xml:space="preserve"> : 26 critères d'acceptation rejoués contre un serveur et une base réels, plus 18 sur les photos.</w:t>
             </w:r>
           </w:p>
         </w:tc>

</xml_diff>